<commit_message>
Arreglando detalles menores de los archivos
</commit_message>
<xml_diff>
--- a/GA1_LPVT/GA1-LPVT.docx
+++ b/GA1_LPVT/GA1-LPVT.docx
@@ -4,6 +4,8 @@
   <w:body>
     <w:p>
       <w:pPr>
+        <w:ind w:left="708" w:firstLine="708"/>
+        <w:jc w:val="center"/>
         <w:rPr>
           <w:lang w:val="es-MX"/>
         </w:rPr>
@@ -17,6 +19,7 @@
     </w:p>
     <w:p>
       <w:pPr>
+        <w:jc w:val="center"/>
         <w:rPr>
           <w:lang w:val="es-MX"/>
         </w:rPr>
@@ -59,11 +62,47 @@
     <w:p>
       <w:pPr>
         <w:rPr>
-          <w:lang w:val="es-MX"/>
-        </w:rPr>
-      </w:pPr>
-      <w:r>
-        <w:rPr>
+          <w:i/>
+          <w:iCs/>
+          <w:lang w:val="es-MX"/>
+        </w:rPr>
+      </w:pPr>
+      <w:r>
+        <w:rPr>
+          <w:b/>
+          <w:bCs/>
+          <w:i/>
+          <w:iCs/>
+          <w:lang w:val="es-MX"/>
+        </w:rPr>
+        <w:t>Ejercicio 1:</w:t>
+      </w:r>
+      <w:r>
+        <w:rPr>
+          <w:i/>
+          <w:iCs/>
+          <w:lang w:val="es-MX"/>
+        </w:rPr>
+        <w:t xml:space="preserve"> </w:t>
+      </w:r>
+      <w:r>
+        <w:rPr>
+          <w:i/>
+          <w:iCs/>
+          <w:lang w:val="es-MX"/>
+        </w:rPr>
+        <w:t>Mi información personal</w:t>
+      </w:r>
+    </w:p>
+    <w:p>
+      <w:pPr>
+        <w:rPr>
+          <w:lang w:val="es-MX"/>
+        </w:rPr>
+      </w:pPr>
+      <w:r>
+        <w:rPr>
+          <w:noProof/>
           <w:lang w:val="es-MX"/>
         </w:rPr>
         <w:drawing>
@@ -106,14 +145,70 @@
     <w:p>
       <w:pPr>
         <w:rPr>
-          <w:lang w:val="es-MX"/>
-        </w:rPr>
-      </w:pPr>
-      <w:r>
-        <w:rPr>
+          <w:i/>
+          <w:iCs/>
+          <w:lang w:val="es-MX"/>
+        </w:rPr>
+      </w:pPr>
+      <w:r>
+        <w:rPr>
+          <w:b/>
+          <w:bCs/>
+          <w:i/>
+          <w:iCs/>
           <w:lang w:val="es-MX"/>
         </w:rPr>
         <w:lastRenderedPageBreak/>
+        <w:t xml:space="preserve">Ejercicio </w:t>
+      </w:r>
+      <w:r>
+        <w:rPr>
+          <w:b/>
+          <w:bCs/>
+          <w:i/>
+          <w:iCs/>
+          <w:lang w:val="es-MX"/>
+        </w:rPr>
+        <w:t>2</w:t>
+      </w:r>
+      <w:r>
+        <w:rPr>
+          <w:b/>
+          <w:bCs/>
+          <w:i/>
+          <w:iCs/>
+          <w:lang w:val="es-MX"/>
+        </w:rPr>
+        <w:t>:</w:t>
+      </w:r>
+      <w:r>
+        <w:rPr>
+          <w:i/>
+          <w:iCs/>
+          <w:lang w:val="es-MX"/>
+        </w:rPr>
+        <w:t xml:space="preserve"> </w:t>
+      </w:r>
+      <w:r>
+        <w:rPr>
+          <w:i/>
+          <w:iCs/>
+          <w:lang w:val="es-MX"/>
+        </w:rPr>
+        <w:t>Edad y años futuros</w:t>
+      </w:r>
+    </w:p>
+    <w:p>
+      <w:pPr>
+        <w:rPr>
+          <w:lang w:val="es-MX"/>
+        </w:rPr>
+      </w:pPr>
+      <w:r>
+        <w:rPr>
+          <w:noProof/>
+          <w:lang w:val="es-MX"/>
+        </w:rPr>
         <w:drawing>
           <wp:inline distT="0" distB="0" distL="0" distR="0" wp14:anchorId="74B29D61" wp14:editId="034C7659">
             <wp:extent cx="4982270" cy="7344800"/>
@@ -154,18 +249,103 @@
     <w:p>
       <w:pPr>
         <w:rPr>
-          <w:lang w:val="es-MX"/>
-        </w:rPr>
-      </w:pPr>
-      <w:r>
-        <w:rPr>
+          <w:b/>
+          <w:bCs/>
+          <w:i/>
+          <w:iCs/>
+          <w:lang w:val="es-MX"/>
+        </w:rPr>
+      </w:pPr>
+    </w:p>
+    <w:p>
+      <w:pPr>
+        <w:rPr>
+          <w:b/>
+          <w:bCs/>
+          <w:i/>
+          <w:iCs/>
+          <w:lang w:val="es-MX"/>
+        </w:rPr>
+      </w:pPr>
+    </w:p>
+    <w:p>
+      <w:pPr>
+        <w:rPr>
+          <w:b/>
+          <w:bCs/>
+          <w:i/>
+          <w:iCs/>
+          <w:lang w:val="es-MX"/>
+        </w:rPr>
+      </w:pPr>
+    </w:p>
+    <w:p>
+      <w:pPr>
+        <w:rPr>
+          <w:b/>
+          <w:bCs/>
+          <w:i/>
+          <w:iCs/>
+          <w:lang w:val="es-MX"/>
+        </w:rPr>
+      </w:pPr>
+    </w:p>
+    <w:p>
+      <w:pPr>
+        <w:rPr>
+          <w:i/>
+          <w:iCs/>
+          <w:lang w:val="es-MX"/>
+        </w:rPr>
+      </w:pPr>
+      <w:r>
+        <w:rPr>
+          <w:b/>
+          <w:bCs/>
+          <w:i/>
+          <w:iCs/>
           <w:lang w:val="es-MX"/>
         </w:rPr>
         <w:lastRenderedPageBreak/>
+        <w:t xml:space="preserve">Ejercicio </w:t>
+      </w:r>
+      <w:r>
+        <w:rPr>
+          <w:b/>
+          <w:bCs/>
+          <w:i/>
+          <w:iCs/>
+          <w:lang w:val="es-MX"/>
+        </w:rPr>
+        <w:t>3</w:t>
+      </w:r>
+      <w:r>
+        <w:rPr>
+          <w:b/>
+          <w:bCs/>
+          <w:i/>
+          <w:iCs/>
+          <w:lang w:val="es-MX"/>
+        </w:rPr>
+        <w:t>:</w:t>
+      </w:r>
+      <w:r>
+        <w:rPr>
+          <w:i/>
+          <w:iCs/>
+          <w:lang w:val="es-MX"/>
+        </w:rPr>
+        <w:t xml:space="preserve"> Cálculo del total de libros</w:t>
+      </w:r>
+      <w:r>
+        <w:rPr>
+          <w:noProof/>
+          <w:lang w:val="es-MX"/>
+        </w:rPr>
         <w:drawing>
-          <wp:inline distT="0" distB="0" distL="0" distR="0" wp14:anchorId="2D6FD388" wp14:editId="3612DE0D">
-            <wp:extent cx="4925112" cy="7363853"/>
-            <wp:effectExtent l="0" t="0" r="8890" b="8890"/>
+          <wp:inline distT="0" distB="0" distL="0" distR="0" wp14:anchorId="052621A4" wp14:editId="35790F1E">
+            <wp:extent cx="4924425" cy="6972300"/>
+            <wp:effectExtent l="0" t="0" r="9525" b="0"/>
             <wp:docPr id="1036229457" name="Imagen 1"/>
             <wp:cNvGraphicFramePr>
               <a:graphicFrameLocks xmlns:a="http://schemas.openxmlformats.org/drawingml/2006/main" noChangeAspect="1"/>
@@ -186,7 +366,7 @@
                   <pic:spPr>
                     <a:xfrm>
                       <a:off x="0" y="0"/>
-                      <a:ext cx="4925112" cy="7363853"/>
+                      <a:ext cx="4927232" cy="6976275"/>
                     </a:xfrm>
                     <a:prstGeom prst="rect">
                       <a:avLst/>
@@ -198,13 +378,124 @@
           </wp:inline>
         </w:drawing>
       </w:r>
-      <w:r>
-        <w:rPr>
+    </w:p>
+    <w:p>
+      <w:pPr>
+        <w:rPr>
+          <w:i/>
+          <w:iCs/>
+          <w:lang w:val="es-MX"/>
+        </w:rPr>
+      </w:pPr>
+    </w:p>
+    <w:p>
+      <w:pPr>
+        <w:rPr>
+          <w:i/>
+          <w:iCs/>
+          <w:lang w:val="es-MX"/>
+        </w:rPr>
+      </w:pPr>
+    </w:p>
+    <w:p>
+      <w:pPr>
+        <w:rPr>
+          <w:i/>
+          <w:iCs/>
+          <w:lang w:val="es-MX"/>
+        </w:rPr>
+      </w:pPr>
+    </w:p>
+    <w:p>
+      <w:pPr>
+        <w:rPr>
+          <w:i/>
+          <w:iCs/>
+          <w:lang w:val="es-MX"/>
+        </w:rPr>
+      </w:pPr>
+    </w:p>
+    <w:p>
+      <w:pPr>
+        <w:rPr>
+          <w:i/>
+          <w:iCs/>
+          <w:lang w:val="es-MX"/>
+        </w:rPr>
+      </w:pPr>
+    </w:p>
+    <w:p>
+      <w:pPr>
+        <w:rPr>
+          <w:i/>
+          <w:iCs/>
+          <w:lang w:val="es-MX"/>
+        </w:rPr>
+      </w:pPr>
+    </w:p>
+    <w:p>
+      <w:pPr>
+        <w:rPr>
+          <w:i/>
+          <w:iCs/>
+          <w:lang w:val="es-MX"/>
+        </w:rPr>
+      </w:pPr>
+      <w:r>
+        <w:rPr>
+          <w:b/>
+          <w:bCs/>
+          <w:i/>
+          <w:iCs/>
           <w:lang w:val="es-MX"/>
         </w:rPr>
         <w:lastRenderedPageBreak/>
+        <w:t xml:space="preserve">Ejercicio </w:t>
+      </w:r>
+      <w:r>
+        <w:rPr>
+          <w:b/>
+          <w:bCs/>
+          <w:i/>
+          <w:iCs/>
+          <w:lang w:val="es-MX"/>
+        </w:rPr>
+        <w:t>4</w:t>
+      </w:r>
+      <w:r>
+        <w:rPr>
+          <w:b/>
+          <w:bCs/>
+          <w:i/>
+          <w:iCs/>
+          <w:lang w:val="es-MX"/>
+        </w:rPr>
+        <w:t>:</w:t>
+      </w:r>
+      <w:r>
+        <w:rPr>
+          <w:i/>
+          <w:iCs/>
+          <w:lang w:val="es-MX"/>
+        </w:rPr>
+        <w:t xml:space="preserve"> Precio de productos</w:t>
+      </w:r>
+    </w:p>
+    <w:p>
+      <w:pPr>
+        <w:rPr>
+          <w:i/>
+          <w:iCs/>
+          <w:lang w:val="es-MX"/>
+        </w:rPr>
+      </w:pPr>
+      <w:r>
+        <w:rPr>
+          <w:noProof/>
+          <w:lang w:val="es-MX"/>
+        </w:rPr>
         <w:drawing>
-          <wp:inline distT="0" distB="0" distL="0" distR="0" wp14:anchorId="628C7AD0" wp14:editId="42506B55">
+          <wp:inline distT="0" distB="0" distL="0" distR="0" wp14:anchorId="23A44495" wp14:editId="6FE7CFE8">
             <wp:extent cx="3801005" cy="7440063"/>
             <wp:effectExtent l="0" t="0" r="9525" b="8890"/>
             <wp:docPr id="1295127587" name="Imagen 1"/>
@@ -239,16 +530,108 @@
           </wp:inline>
         </w:drawing>
       </w:r>
-      <w:r>
-        <w:rPr>
+    </w:p>
+    <w:p>
+      <w:pPr>
+        <w:rPr>
+          <w:i/>
+          <w:iCs/>
+          <w:lang w:val="es-MX"/>
+        </w:rPr>
+      </w:pPr>
+    </w:p>
+    <w:p>
+      <w:pPr>
+        <w:rPr>
+          <w:i/>
+          <w:iCs/>
+          <w:lang w:val="es-MX"/>
+        </w:rPr>
+      </w:pPr>
+    </w:p>
+    <w:p>
+      <w:pPr>
+        <w:rPr>
+          <w:i/>
+          <w:iCs/>
+          <w:lang w:val="es-MX"/>
+        </w:rPr>
+      </w:pPr>
+    </w:p>
+    <w:p>
+      <w:pPr>
+        <w:rPr>
+          <w:i/>
+          <w:iCs/>
+          <w:lang w:val="es-MX"/>
+        </w:rPr>
+      </w:pPr>
+    </w:p>
+    <w:p>
+      <w:pPr>
+        <w:rPr>
+          <w:i/>
+          <w:iCs/>
+          <w:lang w:val="es-MX"/>
+        </w:rPr>
+      </w:pPr>
+      <w:r>
+        <w:rPr>
+          <w:b/>
+          <w:bCs/>
+          <w:i/>
+          <w:iCs/>
           <w:lang w:val="es-MX"/>
         </w:rPr>
         <w:lastRenderedPageBreak/>
+        <w:t xml:space="preserve">Ejercicio </w:t>
+      </w:r>
+      <w:r>
+        <w:rPr>
+          <w:b/>
+          <w:bCs/>
+          <w:i/>
+          <w:iCs/>
+          <w:lang w:val="es-MX"/>
+        </w:rPr>
+        <w:t>5</w:t>
+      </w:r>
+      <w:r>
+        <w:rPr>
+          <w:b/>
+          <w:bCs/>
+          <w:i/>
+          <w:iCs/>
+          <w:lang w:val="es-MX"/>
+        </w:rPr>
+        <w:t>:</w:t>
+      </w:r>
+      <w:r>
+        <w:rPr>
+          <w:i/>
+          <w:iCs/>
+          <w:lang w:val="es-MX"/>
+        </w:rPr>
+        <w:t xml:space="preserve"> Calificación promedio</w:t>
+      </w:r>
+    </w:p>
+    <w:p>
+      <w:pPr>
+        <w:rPr>
+          <w:i/>
+          <w:iCs/>
+          <w:lang w:val="es-MX"/>
+        </w:rPr>
+      </w:pPr>
+      <w:r>
+        <w:rPr>
+          <w:lang w:val="es-MX"/>
+        </w:rPr>
         <w:drawing>
-          <wp:inline distT="0" distB="0" distL="0" distR="0" wp14:anchorId="18A66A6D" wp14:editId="434DA06E">
-            <wp:extent cx="4153480" cy="7411484"/>
-            <wp:effectExtent l="0" t="0" r="0" b="0"/>
-            <wp:docPr id="1232506081" name="Imagen 1"/>
+          <wp:inline distT="0" distB="0" distL="0" distR="0" wp14:anchorId="4A5D095E" wp14:editId="6E3D307D">
+            <wp:extent cx="4544059" cy="7725853"/>
+            <wp:effectExtent l="0" t="0" r="9525" b="8890"/>
+            <wp:docPr id="142197156" name="Imagen 1"/>
             <wp:cNvGraphicFramePr>
               <a:graphicFrameLocks xmlns:a="http://schemas.openxmlformats.org/drawingml/2006/main" noChangeAspect="1"/>
             </wp:cNvGraphicFramePr>
@@ -256,7 +639,7 @@
               <a:graphicData uri="http://schemas.openxmlformats.org/drawingml/2006/picture">
                 <pic:pic xmlns:pic="http://schemas.openxmlformats.org/drawingml/2006/picture">
                   <pic:nvPicPr>
-                    <pic:cNvPr id="1232506081" name=""/>
+                    <pic:cNvPr id="142197156" name=""/>
                     <pic:cNvPicPr/>
                   </pic:nvPicPr>
                   <pic:blipFill>
@@ -268,7 +651,7 @@
                   <pic:spPr>
                     <a:xfrm>
                       <a:off x="0" y="0"/>
-                      <a:ext cx="4153480" cy="7411484"/>
+                      <a:ext cx="4544059" cy="7725853"/>
                     </a:xfrm>
                     <a:prstGeom prst="rect">
                       <a:avLst/>
@@ -280,16 +663,103 @@
           </wp:inline>
         </w:drawing>
       </w:r>
-      <w:r>
-        <w:rPr>
+    </w:p>
+    <w:p>
+      <w:pPr>
+        <w:rPr>
+          <w:b/>
+          <w:bCs/>
+          <w:i/>
+          <w:iCs/>
+          <w:lang w:val="es-MX"/>
+        </w:rPr>
+      </w:pPr>
+    </w:p>
+    <w:p>
+      <w:pPr>
+        <w:rPr>
+          <w:b/>
+          <w:bCs/>
+          <w:i/>
+          <w:iCs/>
+          <w:lang w:val="es-MX"/>
+        </w:rPr>
+      </w:pPr>
+    </w:p>
+    <w:p>
+      <w:pPr>
+        <w:rPr>
+          <w:b/>
+          <w:bCs/>
+          <w:i/>
+          <w:iCs/>
+          <w:lang w:val="es-MX"/>
+        </w:rPr>
+      </w:pPr>
+    </w:p>
+    <w:p>
+      <w:pPr>
+        <w:rPr>
+          <w:i/>
+          <w:iCs/>
+          <w:lang w:val="es-MX"/>
+        </w:rPr>
+      </w:pPr>
+      <w:r>
+        <w:rPr>
+          <w:b/>
+          <w:bCs/>
+          <w:i/>
+          <w:iCs/>
           <w:lang w:val="es-MX"/>
         </w:rPr>
         <w:lastRenderedPageBreak/>
+        <w:t xml:space="preserve">Ejercicio </w:t>
+      </w:r>
+      <w:r>
+        <w:rPr>
+          <w:b/>
+          <w:bCs/>
+          <w:i/>
+          <w:iCs/>
+          <w:lang w:val="es-MX"/>
+        </w:rPr>
+        <w:t>6</w:t>
+      </w:r>
+      <w:r>
+        <w:rPr>
+          <w:b/>
+          <w:bCs/>
+          <w:i/>
+          <w:iCs/>
+          <w:lang w:val="es-MX"/>
+        </w:rPr>
+        <w:t>:</w:t>
+      </w:r>
+      <w:r>
+        <w:rPr>
+          <w:i/>
+          <w:iCs/>
+          <w:lang w:val="es-MX"/>
+        </w:rPr>
+        <w:t xml:space="preserve"> ¿Es mayor de edad?</w:t>
+      </w:r>
+    </w:p>
+    <w:p>
+      <w:pPr>
+        <w:rPr>
+          <w:lang w:val="es-MX"/>
+        </w:rPr>
+      </w:pPr>
+      <w:r>
+        <w:rPr>
+          <w:lang w:val="es-MX"/>
+        </w:rPr>
         <w:drawing>
-          <wp:inline distT="0" distB="0" distL="0" distR="0" wp14:anchorId="41ACCE95" wp14:editId="1D7E1128">
-            <wp:extent cx="4839375" cy="7516274"/>
-            <wp:effectExtent l="0" t="0" r="0" b="8890"/>
-            <wp:docPr id="1102077481" name="Imagen 1"/>
+          <wp:inline distT="0" distB="0" distL="0" distR="0" wp14:anchorId="0BBD5DB6" wp14:editId="7AC0CAC2">
+            <wp:extent cx="4429743" cy="7678222"/>
+            <wp:effectExtent l="0" t="0" r="9525" b="0"/>
+            <wp:docPr id="695375021" name="Imagen 1"/>
             <wp:cNvGraphicFramePr>
               <a:graphicFrameLocks xmlns:a="http://schemas.openxmlformats.org/drawingml/2006/main" noChangeAspect="1"/>
             </wp:cNvGraphicFramePr>
@@ -297,7 +767,7 @@
               <a:graphicData uri="http://schemas.openxmlformats.org/drawingml/2006/picture">
                 <pic:pic xmlns:pic="http://schemas.openxmlformats.org/drawingml/2006/picture">
                   <pic:nvPicPr>
-                    <pic:cNvPr id="1102077481" name=""/>
+                    <pic:cNvPr id="695375021" name=""/>
                     <pic:cNvPicPr/>
                   </pic:nvPicPr>
                   <pic:blipFill>
@@ -309,7 +779,7 @@
                   <pic:spPr>
                     <a:xfrm>
                       <a:off x="0" y="0"/>
-                      <a:ext cx="4839375" cy="7516274"/>
+                      <a:ext cx="4429743" cy="7678222"/>
                     </a:xfrm>
                     <a:prstGeom prst="rect">
                       <a:avLst/>
@@ -325,19 +795,92 @@
     <w:p>
       <w:pPr>
         <w:rPr>
-          <w:lang w:val="es-MX"/>
-        </w:rPr>
-      </w:pPr>
-      <w:r>
-        <w:rPr>
+          <w:b/>
+          <w:bCs/>
+          <w:i/>
+          <w:iCs/>
+          <w:lang w:val="es-MX"/>
+        </w:rPr>
+      </w:pPr>
+    </w:p>
+    <w:p>
+      <w:pPr>
+        <w:rPr>
+          <w:b/>
+          <w:bCs/>
+          <w:i/>
+          <w:iCs/>
+          <w:lang w:val="es-MX"/>
+        </w:rPr>
+      </w:pPr>
+    </w:p>
+    <w:p>
+      <w:pPr>
+        <w:rPr>
+          <w:b/>
+          <w:bCs/>
+          <w:i/>
+          <w:iCs/>
+          <w:lang w:val="es-MX"/>
+        </w:rPr>
+      </w:pPr>
+    </w:p>
+    <w:p>
+      <w:pPr>
+        <w:rPr>
+          <w:i/>
+          <w:iCs/>
+          <w:lang w:val="es-MX"/>
+        </w:rPr>
+      </w:pPr>
+      <w:r>
+        <w:rPr>
+          <w:b/>
+          <w:bCs/>
+          <w:i/>
+          <w:iCs/>
           <w:lang w:val="es-MX"/>
         </w:rPr>
         <w:lastRenderedPageBreak/>
+        <w:t xml:space="preserve">Ejercicio </w:t>
+      </w:r>
+      <w:r>
+        <w:rPr>
+          <w:b/>
+          <w:bCs/>
+          <w:i/>
+          <w:iCs/>
+          <w:lang w:val="es-MX"/>
+        </w:rPr>
+        <w:t>7</w:t>
+      </w:r>
+      <w:r>
+        <w:rPr>
+          <w:b/>
+          <w:bCs/>
+          <w:i/>
+          <w:iCs/>
+          <w:lang w:val="es-MX"/>
+        </w:rPr>
+        <w:t>:</w:t>
+      </w:r>
+      <w:r>
+        <w:rPr>
+          <w:i/>
+          <w:iCs/>
+          <w:lang w:val="es-MX"/>
+        </w:rPr>
+        <w:t xml:space="preserve"> Encender una luz</w:t>
+      </w:r>
+      <w:r>
+        <w:rPr>
+          <w:lang w:val="es-MX"/>
+        </w:rPr>
         <w:drawing>
-          <wp:inline distT="0" distB="0" distL="0" distR="0" wp14:anchorId="03F6306F" wp14:editId="5E699C5C">
-            <wp:extent cx="6858000" cy="5865495"/>
-            <wp:effectExtent l="0" t="0" r="0" b="1905"/>
-            <wp:docPr id="1328870543" name="Imagen 1"/>
+          <wp:inline distT="0" distB="0" distL="0" distR="0" wp14:anchorId="78EC5F72" wp14:editId="267E10E3">
+            <wp:extent cx="6858000" cy="6979920"/>
+            <wp:effectExtent l="0" t="0" r="0" b="0"/>
+            <wp:docPr id="349291086" name="Imagen 1"/>
             <wp:cNvGraphicFramePr>
               <a:graphicFrameLocks xmlns:a="http://schemas.openxmlformats.org/drawingml/2006/main" noChangeAspect="1"/>
             </wp:cNvGraphicFramePr>
@@ -345,7 +888,7 @@
               <a:graphicData uri="http://schemas.openxmlformats.org/drawingml/2006/picture">
                 <pic:pic xmlns:pic="http://schemas.openxmlformats.org/drawingml/2006/picture">
                   <pic:nvPicPr>
-                    <pic:cNvPr id="1328870543" name=""/>
+                    <pic:cNvPr id="349291086" name=""/>
                     <pic:cNvPicPr/>
                   </pic:nvPicPr>
                   <pic:blipFill>
@@ -357,7 +900,7 @@
                   <pic:spPr>
                     <a:xfrm>
                       <a:off x="0" y="0"/>
-                      <a:ext cx="6858000" cy="5865495"/>
+                      <a:ext cx="6858000" cy="6979920"/>
                     </a:xfrm>
                     <a:prstGeom prst="rect">
                       <a:avLst/>
@@ -369,13 +912,134 @@
           </wp:inline>
         </w:drawing>
       </w:r>
-      <w:r>
-        <w:rPr>
+    </w:p>
+    <w:p>
+      <w:pPr>
+        <w:rPr>
+          <w:b/>
+          <w:bCs/>
+          <w:i/>
+          <w:iCs/>
+          <w:lang w:val="es-MX"/>
+        </w:rPr>
+      </w:pPr>
+    </w:p>
+    <w:p>
+      <w:pPr>
+        <w:rPr>
+          <w:b/>
+          <w:bCs/>
+          <w:i/>
+          <w:iCs/>
+          <w:lang w:val="es-MX"/>
+        </w:rPr>
+      </w:pPr>
+    </w:p>
+    <w:p>
+      <w:pPr>
+        <w:rPr>
+          <w:b/>
+          <w:bCs/>
+          <w:i/>
+          <w:iCs/>
+          <w:lang w:val="es-MX"/>
+        </w:rPr>
+      </w:pPr>
+    </w:p>
+    <w:p>
+      <w:pPr>
+        <w:rPr>
+          <w:b/>
+          <w:bCs/>
+          <w:i/>
+          <w:iCs/>
+          <w:lang w:val="es-MX"/>
+        </w:rPr>
+      </w:pPr>
+    </w:p>
+    <w:p>
+      <w:pPr>
+        <w:rPr>
+          <w:b/>
+          <w:bCs/>
+          <w:i/>
+          <w:iCs/>
+          <w:lang w:val="es-MX"/>
+        </w:rPr>
+      </w:pPr>
+    </w:p>
+    <w:p>
+      <w:pPr>
+        <w:rPr>
+          <w:b/>
+          <w:bCs/>
+          <w:i/>
+          <w:iCs/>
+          <w:lang w:val="es-MX"/>
+        </w:rPr>
+      </w:pPr>
+    </w:p>
+    <w:p>
+      <w:pPr>
+        <w:rPr>
+          <w:i/>
+          <w:iCs/>
+          <w:lang w:val="es-MX"/>
+        </w:rPr>
+      </w:pPr>
+      <w:r>
+        <w:rPr>
+          <w:b/>
+          <w:bCs/>
+          <w:i/>
+          <w:iCs/>
           <w:lang w:val="es-MX"/>
         </w:rPr>
         <w:lastRenderedPageBreak/>
+        <w:t xml:space="preserve">Ejercicio </w:t>
+      </w:r>
+      <w:r>
+        <w:rPr>
+          <w:b/>
+          <w:bCs/>
+          <w:i/>
+          <w:iCs/>
+          <w:lang w:val="es-MX"/>
+        </w:rPr>
+        <w:t>8</w:t>
+      </w:r>
+      <w:r>
+        <w:rPr>
+          <w:b/>
+          <w:bCs/>
+          <w:i/>
+          <w:iCs/>
+          <w:lang w:val="es-MX"/>
+        </w:rPr>
+        <w:t>:</w:t>
+      </w:r>
+      <w:r>
+        <w:rPr>
+          <w:i/>
+          <w:iCs/>
+          <w:lang w:val="es-MX"/>
+        </w:rPr>
+        <w:t xml:space="preserve"> Concatenación de nombres</w:t>
+      </w:r>
+    </w:p>
+    <w:p>
+      <w:pPr>
+        <w:rPr>
+          <w:lang w:val="es-MX"/>
+        </w:rPr>
+      </w:pPr>
+      <w:r>
+        <w:rPr>
+          <w:noProof/>
+          <w:lang w:val="es-MX"/>
+        </w:rPr>
         <w:drawing>
-          <wp:inline distT="0" distB="0" distL="0" distR="0" wp14:anchorId="3D0C6629" wp14:editId="1FB7FDC0">
+          <wp:inline distT="0" distB="0" distL="0" distR="0" wp14:anchorId="3D0C6629" wp14:editId="223AA460">
             <wp:extent cx="4639322" cy="7421011"/>
             <wp:effectExtent l="0" t="0" r="8890" b="8890"/>
             <wp:docPr id="2072917274" name="Imagen 1"/>
@@ -414,14 +1078,106 @@
     <w:p>
       <w:pPr>
         <w:rPr>
-          <w:lang w:val="es-MX"/>
-        </w:rPr>
-      </w:pPr>
-      <w:r>
-        <w:rPr>
+          <w:b/>
+          <w:bCs/>
+          <w:i/>
+          <w:iCs/>
+          <w:lang w:val="es-MX"/>
+        </w:rPr>
+      </w:pPr>
+    </w:p>
+    <w:p>
+      <w:pPr>
+        <w:rPr>
+          <w:b/>
+          <w:bCs/>
+          <w:i/>
+          <w:iCs/>
+          <w:lang w:val="es-MX"/>
+        </w:rPr>
+      </w:pPr>
+    </w:p>
+    <w:p>
+      <w:pPr>
+        <w:rPr>
+          <w:b/>
+          <w:bCs/>
+          <w:i/>
+          <w:iCs/>
+          <w:lang w:val="es-MX"/>
+        </w:rPr>
+      </w:pPr>
+    </w:p>
+    <w:p>
+      <w:pPr>
+        <w:rPr>
+          <w:b/>
+          <w:bCs/>
+          <w:i/>
+          <w:iCs/>
+          <w:lang w:val="es-MX"/>
+        </w:rPr>
+      </w:pPr>
+    </w:p>
+    <w:p>
+      <w:pPr>
+        <w:rPr>
+          <w:i/>
+          <w:iCs/>
+          <w:lang w:val="es-MX"/>
+        </w:rPr>
+      </w:pPr>
+      <w:r>
+        <w:rPr>
+          <w:b/>
+          <w:bCs/>
+          <w:i/>
+          <w:iCs/>
           <w:lang w:val="es-MX"/>
         </w:rPr>
         <w:lastRenderedPageBreak/>
+        <w:t xml:space="preserve">Ejercicio </w:t>
+      </w:r>
+      <w:r>
+        <w:rPr>
+          <w:b/>
+          <w:bCs/>
+          <w:i/>
+          <w:iCs/>
+          <w:lang w:val="es-MX"/>
+        </w:rPr>
+        <w:t>9</w:t>
+      </w:r>
+      <w:r>
+        <w:rPr>
+          <w:b/>
+          <w:bCs/>
+          <w:i/>
+          <w:iCs/>
+          <w:lang w:val="es-MX"/>
+        </w:rPr>
+        <w:t>:</w:t>
+      </w:r>
+      <w:r>
+        <w:rPr>
+          <w:i/>
+          <w:iCs/>
+          <w:lang w:val="es-MX"/>
+        </w:rPr>
+        <w:t xml:space="preserve"> Repetir un mensaje</w:t>
+      </w:r>
+    </w:p>
+    <w:p>
+      <w:pPr>
+        <w:rPr>
+          <w:lang w:val="es-MX"/>
+        </w:rPr>
+      </w:pPr>
+      <w:r>
+        <w:rPr>
+          <w:noProof/>
+          <w:lang w:val="es-MX"/>
+        </w:rPr>
         <w:drawing>
           <wp:inline distT="0" distB="0" distL="0" distR="0" wp14:anchorId="35DEA5EC" wp14:editId="3C26F0F0">
             <wp:extent cx="6858000" cy="6202680"/>
@@ -458,19 +1214,145 @@
           </wp:inline>
         </w:drawing>
       </w:r>
-      <w:r>
-        <w:rPr>
-          <w:lang w:val="es-MX"/>
-        </w:rPr>
-        <w:t>}</w:t>
-      </w:r>
-      <w:r>
-        <w:rPr>
+    </w:p>
+    <w:p>
+      <w:pPr>
+        <w:rPr>
+          <w:lang w:val="es-MX"/>
+        </w:rPr>
+      </w:pPr>
+    </w:p>
+    <w:p>
+      <w:pPr>
+        <w:rPr>
+          <w:lang w:val="es-MX"/>
+        </w:rPr>
+      </w:pPr>
+    </w:p>
+    <w:p>
+      <w:pPr>
+        <w:rPr>
+          <w:lang w:val="es-MX"/>
+        </w:rPr>
+      </w:pPr>
+    </w:p>
+    <w:p>
+      <w:pPr>
+        <w:rPr>
+          <w:lang w:val="es-MX"/>
+        </w:rPr>
+      </w:pPr>
+    </w:p>
+    <w:p>
+      <w:pPr>
+        <w:rPr>
+          <w:lang w:val="es-MX"/>
+        </w:rPr>
+      </w:pPr>
+    </w:p>
+    <w:p>
+      <w:pPr>
+        <w:rPr>
+          <w:lang w:val="es-MX"/>
+        </w:rPr>
+      </w:pPr>
+    </w:p>
+    <w:p>
+      <w:pPr>
+        <w:rPr>
+          <w:lang w:val="es-MX"/>
+        </w:rPr>
+      </w:pPr>
+    </w:p>
+    <w:p>
+      <w:pPr>
+        <w:rPr>
+          <w:lang w:val="es-MX"/>
+        </w:rPr>
+      </w:pPr>
+    </w:p>
+    <w:p>
+      <w:pPr>
+        <w:rPr>
+          <w:i/>
+          <w:iCs/>
+          <w:lang w:val="es-MX"/>
+        </w:rPr>
+      </w:pPr>
+      <w:r>
+        <w:rPr>
+          <w:b/>
+          <w:bCs/>
+          <w:i/>
+          <w:iCs/>
           <w:lang w:val="es-MX"/>
         </w:rPr>
         <w:lastRenderedPageBreak/>
+        <w:t>Ejercicio 1</w:t>
+      </w:r>
+      <w:r>
+        <w:rPr>
+          <w:b/>
+          <w:bCs/>
+          <w:i/>
+          <w:iCs/>
+          <w:lang w:val="es-MX"/>
+        </w:rPr>
+        <w:t>0</w:t>
+      </w:r>
+      <w:r>
+        <w:rPr>
+          <w:b/>
+          <w:bCs/>
+          <w:i/>
+          <w:iCs/>
+          <w:lang w:val="es-MX"/>
+        </w:rPr>
+        <w:t>:</w:t>
+      </w:r>
+      <w:r>
+        <w:rPr>
+          <w:i/>
+          <w:iCs/>
+          <w:lang w:val="es-MX"/>
+        </w:rPr>
+        <w:t xml:space="preserve"> Convertir de </w:t>
+      </w:r>
+      <w:proofErr w:type="spellStart"/>
+      <w:r>
+        <w:rPr>
+          <w:i/>
+          <w:iCs/>
+          <w:lang w:val="es-MX"/>
+        </w:rPr>
+        <w:t>int</w:t>
+      </w:r>
+      <w:proofErr w:type="spellEnd"/>
+      <w:r>
+        <w:rPr>
+          <w:i/>
+          <w:iCs/>
+          <w:lang w:val="es-MX"/>
+        </w:rPr>
+        <w:t xml:space="preserve"> a </w:t>
+      </w:r>
+      <w:proofErr w:type="spellStart"/>
+      <w:r>
+        <w:rPr>
+          <w:i/>
+          <w:iCs/>
+          <w:lang w:val="es-MX"/>
+        </w:rPr>
+        <w:t>float</w:t>
+      </w:r>
+      <w:proofErr w:type="spellEnd"/>
+      <w:r>
+        <w:rPr>
+          <w:noProof/>
+          <w:lang w:val="es-MX"/>
+        </w:rPr>
         <w:drawing>
-          <wp:inline distT="0" distB="0" distL="0" distR="0" wp14:anchorId="58EA96DA" wp14:editId="5A22793C">
+          <wp:inline distT="0" distB="0" distL="0" distR="0" wp14:anchorId="0C350B3A" wp14:editId="720AC32E">
             <wp:extent cx="6858000" cy="6158230"/>
             <wp:effectExtent l="0" t="0" r="0" b="0"/>
             <wp:docPr id="1339261384" name="Imagen 1"/>
@@ -505,13 +1387,177 @@
           </wp:inline>
         </w:drawing>
       </w:r>
-      <w:r>
-        <w:rPr>
+    </w:p>
+    <w:p>
+      <w:pPr>
+        <w:rPr>
+          <w:b/>
+          <w:bCs/>
+          <w:i/>
+          <w:iCs/>
+          <w:lang w:val="es-MX"/>
+        </w:rPr>
+      </w:pPr>
+    </w:p>
+    <w:p>
+      <w:pPr>
+        <w:rPr>
+          <w:b/>
+          <w:bCs/>
+          <w:i/>
+          <w:iCs/>
+          <w:lang w:val="es-MX"/>
+        </w:rPr>
+      </w:pPr>
+    </w:p>
+    <w:p>
+      <w:pPr>
+        <w:rPr>
+          <w:b/>
+          <w:bCs/>
+          <w:i/>
+          <w:iCs/>
+          <w:lang w:val="es-MX"/>
+        </w:rPr>
+      </w:pPr>
+    </w:p>
+    <w:p>
+      <w:pPr>
+        <w:rPr>
+          <w:b/>
+          <w:bCs/>
+          <w:i/>
+          <w:iCs/>
+          <w:lang w:val="es-MX"/>
+        </w:rPr>
+      </w:pPr>
+    </w:p>
+    <w:p>
+      <w:pPr>
+        <w:rPr>
+          <w:b/>
+          <w:bCs/>
+          <w:i/>
+          <w:iCs/>
+          <w:lang w:val="es-MX"/>
+        </w:rPr>
+      </w:pPr>
+    </w:p>
+    <w:p>
+      <w:pPr>
+        <w:rPr>
+          <w:b/>
+          <w:bCs/>
+          <w:i/>
+          <w:iCs/>
+          <w:lang w:val="es-MX"/>
+        </w:rPr>
+      </w:pPr>
+    </w:p>
+    <w:p>
+      <w:pPr>
+        <w:rPr>
+          <w:b/>
+          <w:bCs/>
+          <w:i/>
+          <w:iCs/>
+          <w:lang w:val="es-MX"/>
+        </w:rPr>
+      </w:pPr>
+    </w:p>
+    <w:p>
+      <w:pPr>
+        <w:rPr>
+          <w:b/>
+          <w:bCs/>
+          <w:i/>
+          <w:iCs/>
+          <w:lang w:val="es-MX"/>
+        </w:rPr>
+      </w:pPr>
+    </w:p>
+    <w:p>
+      <w:pPr>
+        <w:rPr>
+          <w:i/>
+          <w:iCs/>
+          <w:lang w:val="es-MX"/>
+        </w:rPr>
+      </w:pPr>
+      <w:r>
+        <w:rPr>
+          <w:b/>
+          <w:bCs/>
+          <w:i/>
+          <w:iCs/>
           <w:lang w:val="es-MX"/>
         </w:rPr>
         <w:lastRenderedPageBreak/>
+        <w:t>Ejercicio 1</w:t>
+      </w:r>
+      <w:r>
+        <w:rPr>
+          <w:b/>
+          <w:bCs/>
+          <w:i/>
+          <w:iCs/>
+          <w:lang w:val="es-MX"/>
+        </w:rPr>
+        <w:t>1</w:t>
+      </w:r>
+      <w:r>
+        <w:rPr>
+          <w:b/>
+          <w:bCs/>
+          <w:i/>
+          <w:iCs/>
+          <w:lang w:val="es-MX"/>
+        </w:rPr>
+        <w:t>:</w:t>
+      </w:r>
+      <w:r>
+        <w:rPr>
+          <w:i/>
+          <w:iCs/>
+          <w:lang w:val="es-MX"/>
+        </w:rPr>
+        <w:t xml:space="preserve"> Convertir de </w:t>
+      </w:r>
+      <w:proofErr w:type="spellStart"/>
+      <w:r>
+        <w:rPr>
+          <w:i/>
+          <w:iCs/>
+          <w:lang w:val="es-MX"/>
+        </w:rPr>
+        <w:t>float</w:t>
+      </w:r>
+      <w:proofErr w:type="spellEnd"/>
+      <w:r>
+        <w:rPr>
+          <w:i/>
+          <w:iCs/>
+          <w:lang w:val="es-MX"/>
+        </w:rPr>
+        <w:t xml:space="preserve"> a </w:t>
+      </w:r>
+      <w:proofErr w:type="spellStart"/>
+      <w:r>
+        <w:rPr>
+          <w:i/>
+          <w:iCs/>
+          <w:lang w:val="es-MX"/>
+        </w:rPr>
+        <w:t>int</w:t>
+      </w:r>
+      <w:proofErr w:type="spellEnd"/>
+      <w:r>
+        <w:rPr>
+          <w:noProof/>
+          <w:lang w:val="es-MX"/>
+        </w:rPr>
         <w:drawing>
-          <wp:inline distT="0" distB="0" distL="0" distR="0" wp14:anchorId="3876FE20" wp14:editId="132845FA">
+          <wp:inline distT="0" distB="0" distL="0" distR="0" wp14:anchorId="7706577E" wp14:editId="5A6A5DE7">
             <wp:extent cx="6858000" cy="6283960"/>
             <wp:effectExtent l="0" t="0" r="0" b="2540"/>
             <wp:docPr id="2050193838" name="Imagen 1"/>
@@ -546,13 +1592,167 @@
           </wp:inline>
         </w:drawing>
       </w:r>
-      <w:r>
-        <w:rPr>
+    </w:p>
+    <w:p>
+      <w:pPr>
+        <w:rPr>
+          <w:b/>
+          <w:bCs/>
+          <w:i/>
+          <w:iCs/>
+          <w:lang w:val="es-MX"/>
+        </w:rPr>
+      </w:pPr>
+    </w:p>
+    <w:p>
+      <w:pPr>
+        <w:rPr>
+          <w:b/>
+          <w:bCs/>
+          <w:i/>
+          <w:iCs/>
+          <w:lang w:val="es-MX"/>
+        </w:rPr>
+      </w:pPr>
+    </w:p>
+    <w:p>
+      <w:pPr>
+        <w:rPr>
+          <w:b/>
+          <w:bCs/>
+          <w:i/>
+          <w:iCs/>
+          <w:lang w:val="es-MX"/>
+        </w:rPr>
+      </w:pPr>
+    </w:p>
+    <w:p>
+      <w:pPr>
+        <w:rPr>
+          <w:b/>
+          <w:bCs/>
+          <w:i/>
+          <w:iCs/>
+          <w:lang w:val="es-MX"/>
+        </w:rPr>
+      </w:pPr>
+    </w:p>
+    <w:p>
+      <w:pPr>
+        <w:rPr>
+          <w:b/>
+          <w:bCs/>
+          <w:i/>
+          <w:iCs/>
+          <w:lang w:val="es-MX"/>
+        </w:rPr>
+      </w:pPr>
+    </w:p>
+    <w:p>
+      <w:pPr>
+        <w:rPr>
+          <w:b/>
+          <w:bCs/>
+          <w:i/>
+          <w:iCs/>
+          <w:lang w:val="es-MX"/>
+        </w:rPr>
+      </w:pPr>
+    </w:p>
+    <w:p>
+      <w:pPr>
+        <w:rPr>
+          <w:b/>
+          <w:bCs/>
+          <w:i/>
+          <w:iCs/>
+          <w:lang w:val="es-MX"/>
+        </w:rPr>
+      </w:pPr>
+    </w:p>
+    <w:p>
+      <w:pPr>
+        <w:rPr>
+          <w:b/>
+          <w:bCs/>
+          <w:i/>
+          <w:iCs/>
+          <w:lang w:val="es-MX"/>
+        </w:rPr>
+      </w:pPr>
+    </w:p>
+    <w:p>
+      <w:pPr>
+        <w:rPr>
+          <w:b/>
+          <w:bCs/>
+          <w:i/>
+          <w:iCs/>
+          <w:lang w:val="es-MX"/>
+        </w:rPr>
+      </w:pPr>
+      <w:r>
+        <w:rPr>
+          <w:b/>
+          <w:bCs/>
+          <w:i/>
+          <w:iCs/>
           <w:lang w:val="es-MX"/>
         </w:rPr>
         <w:lastRenderedPageBreak/>
+        <w:t>Ejercicio 1</w:t>
+      </w:r>
+      <w:r>
+        <w:rPr>
+          <w:b/>
+          <w:bCs/>
+          <w:i/>
+          <w:iCs/>
+          <w:lang w:val="es-MX"/>
+        </w:rPr>
+        <w:t>2</w:t>
+      </w:r>
+      <w:r>
+        <w:rPr>
+          <w:b/>
+          <w:bCs/>
+          <w:i/>
+          <w:iCs/>
+          <w:lang w:val="es-MX"/>
+        </w:rPr>
+        <w:t>:</w:t>
+      </w:r>
+      <w:r>
+        <w:rPr>
+          <w:i/>
+          <w:iCs/>
+          <w:lang w:val="es-MX"/>
+        </w:rPr>
+        <w:t xml:space="preserve"> </w:t>
+      </w:r>
+      <w:r>
+        <w:rPr>
+          <w:i/>
+          <w:iCs/>
+          <w:lang w:val="es-MX"/>
+        </w:rPr>
+        <w:t>C</w:t>
+      </w:r>
+      <w:r>
+        <w:rPr>
+          <w:i/>
+          <w:iCs/>
+          <w:lang w:val="es-MX"/>
+        </w:rPr>
+        <w:t>onstante en Python</w:t>
+      </w:r>
+      <w:r>
+        <w:rPr>
+          <w:noProof/>
+          <w:lang w:val="es-MX"/>
+        </w:rPr>
         <w:drawing>
-          <wp:inline distT="0" distB="0" distL="0" distR="0" wp14:anchorId="068D41E0" wp14:editId="481F7905">
+          <wp:inline distT="0" distB="0" distL="0" distR="0" wp14:anchorId="560DD1A2" wp14:editId="49107AD1">
             <wp:extent cx="6858000" cy="6410325"/>
             <wp:effectExtent l="0" t="0" r="0" b="9525"/>
             <wp:docPr id="757352290" name="Imagen 1"/>
@@ -587,11 +1787,143 @@
           </wp:inline>
         </w:drawing>
       </w:r>
-      <w:r>
-        <w:rPr>
+    </w:p>
+    <w:p>
+      <w:pPr>
+        <w:rPr>
+          <w:b/>
+          <w:bCs/>
+          <w:i/>
+          <w:iCs/>
+          <w:lang w:val="es-MX"/>
+        </w:rPr>
+      </w:pPr>
+    </w:p>
+    <w:p>
+      <w:pPr>
+        <w:rPr>
+          <w:b/>
+          <w:bCs/>
+          <w:i/>
+          <w:iCs/>
+          <w:lang w:val="es-MX"/>
+        </w:rPr>
+      </w:pPr>
+    </w:p>
+    <w:p>
+      <w:pPr>
+        <w:rPr>
+          <w:b/>
+          <w:bCs/>
+          <w:i/>
+          <w:iCs/>
+          <w:lang w:val="es-MX"/>
+        </w:rPr>
+      </w:pPr>
+    </w:p>
+    <w:p>
+      <w:pPr>
+        <w:rPr>
+          <w:b/>
+          <w:bCs/>
+          <w:i/>
+          <w:iCs/>
+          <w:lang w:val="es-MX"/>
+        </w:rPr>
+      </w:pPr>
+    </w:p>
+    <w:p>
+      <w:pPr>
+        <w:rPr>
+          <w:b/>
+          <w:bCs/>
+          <w:i/>
+          <w:iCs/>
+          <w:lang w:val="es-MX"/>
+        </w:rPr>
+      </w:pPr>
+    </w:p>
+    <w:p>
+      <w:pPr>
+        <w:rPr>
+          <w:b/>
+          <w:bCs/>
+          <w:i/>
+          <w:iCs/>
+          <w:lang w:val="es-MX"/>
+        </w:rPr>
+      </w:pPr>
+    </w:p>
+    <w:p>
+      <w:pPr>
+        <w:rPr>
+          <w:b/>
+          <w:bCs/>
+          <w:i/>
+          <w:iCs/>
+          <w:lang w:val="es-MX"/>
+        </w:rPr>
+      </w:pPr>
+    </w:p>
+    <w:p>
+      <w:pPr>
+        <w:rPr>
+          <w:i/>
+          <w:iCs/>
+          <w:lang w:val="es-MX"/>
+        </w:rPr>
+      </w:pPr>
+      <w:r>
+        <w:rPr>
+          <w:b/>
+          <w:bCs/>
+          <w:i/>
+          <w:iCs/>
           <w:lang w:val="es-MX"/>
         </w:rPr>
         <w:lastRenderedPageBreak/>
+        <w:t>Ejercicio 1</w:t>
+      </w:r>
+      <w:r>
+        <w:rPr>
+          <w:b/>
+          <w:bCs/>
+          <w:i/>
+          <w:iCs/>
+          <w:lang w:val="es-MX"/>
+        </w:rPr>
+        <w:t>3</w:t>
+      </w:r>
+      <w:r>
+        <w:rPr>
+          <w:b/>
+          <w:bCs/>
+          <w:i/>
+          <w:iCs/>
+          <w:lang w:val="es-MX"/>
+        </w:rPr>
+        <w:t>:</w:t>
+      </w:r>
+      <w:r>
+        <w:rPr>
+          <w:i/>
+          <w:iCs/>
+          <w:lang w:val="es-MX"/>
+        </w:rPr>
+        <w:t xml:space="preserve"> Cálculo de salario con bono e impuesto</w:t>
+      </w:r>
+    </w:p>
+    <w:p>
+      <w:pPr>
+        <w:rPr>
+          <w:lang w:val="es-MX"/>
+        </w:rPr>
+      </w:pPr>
+      <w:r>
+        <w:rPr>
+          <w:noProof/>
+          <w:lang w:val="es-MX"/>
+        </w:rPr>
         <w:drawing>
           <wp:inline distT="0" distB="0" distL="0" distR="0" wp14:anchorId="1C66993C" wp14:editId="2711552F">
             <wp:extent cx="5725324" cy="8383170"/>
@@ -1046,6 +2378,7 @@
   <w:style w:type="paragraph" w:default="1" w:styleId="Normal">
     <w:name w:val="Normal"/>
     <w:qFormat/>
+    <w:rsid w:val="0025554E"/>
   </w:style>
   <w:style w:type="paragraph" w:styleId="Ttulo1">
     <w:name w:val="heading 1"/>
@@ -1249,7 +2582,6 @@
   <w:style w:type="character" w:default="1" w:styleId="Fuentedeprrafopredeter">
     <w:name w:val="Default Paragraph Font"/>
     <w:uiPriority w:val="1"/>
-    <w:semiHidden/>
     <w:unhideWhenUsed/>
   </w:style>
   <w:style w:type="table" w:default="1" w:styleId="Tablanormal">

</xml_diff>